<commit_message>
Add a system architecture figure to the report
Section 3.1 described the architecture as an ASCII pipeline sketch, which
carried the stage order but nothing about layering, the review gate or the
shared domain model.

Replaces it with a rendered layered diagram. The structure was derived by
running graphify over backend/umlrev and frontend/src: 186 nodes and 322
edges extracted by AST, clustered into 15 communities that line up with the
package boundaries, with SymbolExtractor, DiagramEngine, Project and
FeatureLabeller surfacing as the most connected nodes. The figure keeps
those as the load-bearing components rather than inventing a tidier story.

The diagram itself is authored as Mermaid and kept alongside the PNG so it
stays editable, matching how the project treats its own output. Figures 1
to 7 renumber to 2 to 8.

graphify-out/ is git-ignored; it is tooling output, regenerable from the
source tree.

Co-Authored-By: Claude Opus 5 <noreply@anthropic.com>
</commit_message>
<xml_diff>
--- a/docs/B124_B129_UMLRev_MiniProject_Report.docx
+++ b/docs/B124_B129_UMLRev_MiniProject_Report.docx
@@ -764,93 +764,82 @@
     </w:p>
     <w:p>
       <w:pPr>
-        <w:spacing w:after="0" w:line="240" w:lineRule="auto"/>
+        <w:spacing w:after="120" w:before="0"/>
+        <w:jc w:val="both"/>
       </w:pPr>
       <w:r>
         <w:rPr>
-          <w:rFonts w:ascii="Consolas" w:hAnsi="Consolas" w:eastAsia="Consolas"/>
-          <w:sz w:val="17"/>
+          <w:b w:val="0"/>
+          <w:i w:val="0"/>
+          <w:sz w:val="21"/>
         </w:rPr>
-        <w:t xml:space="preserve">  Repository  ---&gt;  SymbolExtractor    ---&gt;  Project { classes, relationships }</w:t>
+        <w:t>Figure 1 shows the layered structure. The numbered bands are the order a request travels: the dashboard calls the REST API, which drives the analysis stages, which hand a feature proposal to the developer for approval before any diagram is synthesised. The model package sits beneath every stage as the shared domain core, and the two external systems - a GitHub repository and an optional LLM provider - are the only outside dependencies.</w:t>
+      </w:r>
+    </w:p>
+    <w:p>
+      <w:r>
+        <w:br w:type="page"/>
       </w:r>
     </w:p>
     <w:p>
       <w:pPr>
-        <w:spacing w:after="0" w:line="240" w:lineRule="auto"/>
+        <w:spacing w:before="120" w:after="60"/>
+        <w:jc w:val="center"/>
       </w:pPr>
       <w:r>
-        <w:rPr>
-          <w:rFonts w:ascii="Consolas" w:hAnsi="Consolas" w:eastAsia="Consolas"/>
-          <w:sz w:val="17"/>
-        </w:rPr>
-        <w:t xml:space="preserve">                      (AST parsing, 8 languages)</w:t>
+        <w:drawing>
+          <wp:inline xmlns:a="http://schemas.openxmlformats.org/drawingml/2006/main" xmlns:pic="http://schemas.openxmlformats.org/drawingml/2006/picture">
+            <wp:extent cx="4709160" cy="6521593"/>
+            <wp:docPr id="1" name="Picture 1"/>
+            <wp:cNvGraphicFramePr>
+              <a:graphicFrameLocks noChangeAspect="1"/>
+            </wp:cNvGraphicFramePr>
+            <a:graphic>
+              <a:graphicData uri="http://schemas.openxmlformats.org/drawingml/2006/picture">
+                <pic:pic>
+                  <pic:nvPicPr>
+                    <pic:cNvPr id="0" name="arch.png"/>
+                    <pic:cNvPicPr/>
+                  </pic:nvPicPr>
+                  <pic:blipFill>
+                    <a:blip r:embed="rId10"/>
+                    <a:stretch>
+                      <a:fillRect/>
+                    </a:stretch>
+                  </pic:blipFill>
+                  <pic:spPr>
+                    <a:xfrm>
+                      <a:off x="0" y="0"/>
+                      <a:ext cx="4709160" cy="6521593"/>
+                    </a:xfrm>
+                    <a:prstGeom prst="rect"/>
+                  </pic:spPr>
+                </pic:pic>
+              </a:graphicData>
+            </a:graphic>
+          </wp:inline>
+        </w:drawing>
       </w:r>
     </w:p>
     <w:p>
       <w:pPr>
-        <w:spacing w:after="0" w:line="240" w:lineRule="auto"/>
+        <w:spacing w:after="220" w:before="0"/>
+        <w:jc w:val="center"/>
       </w:pPr>
       <w:r>
         <w:rPr>
-          <w:rFonts w:ascii="Consolas" w:hAnsi="Consolas" w:eastAsia="Consolas"/>
+          <w:b w:val="0"/>
+          <w:i/>
+          <w:color w:val="595959"/>
           <w:sz w:val="17"/>
         </w:rPr>
-        <w:t xml:space="preserve">              ---&gt;  ClusterEngine      ---&gt;  Cluster[]   (structural cohesion)</w:t>
+        <w:t>Figure 1 - System architecture: layered view of the analysis pipeline, the developer review gate, the Strategy-based diagram engine, and the shared domain model</w:t>
       </w:r>
     </w:p>
     <w:p>
-      <w:pPr>
-        <w:spacing w:after="0" w:line="240" w:lineRule="auto"/>
-      </w:pPr>
       <w:r>
-        <w:rPr>
-          <w:rFonts w:ascii="Consolas" w:hAnsi="Consolas" w:eastAsia="Consolas"/>
-          <w:sz w:val="17"/>
-        </w:rPr>
-        <w:t xml:space="preserve">              ---&gt;  FeatureLabeller    ---&gt;  Feature[]   (name + confidence)</w:t>
+        <w:br w:type="page"/>
       </w:r>
-    </w:p>
-    <w:p>
-      <w:pPr>
-        <w:spacing w:after="0" w:line="240" w:lineRule="auto"/>
-      </w:pPr>
-      <w:r>
-        <w:rPr>
-          <w:rFonts w:ascii="Consolas" w:hAnsi="Consolas" w:eastAsia="Consolas"/>
-          <w:sz w:val="17"/>
-        </w:rPr>
-        <w:t xml:space="preserve">              ---&gt;  [ developer review and approval ]</w:t>
-      </w:r>
-    </w:p>
-    <w:p>
-      <w:pPr>
-        <w:spacing w:after="0" w:line="240" w:lineRule="auto"/>
-      </w:pPr>
-      <w:r>
-        <w:rPr>
-          <w:rFonts w:ascii="Consolas" w:hAnsi="Consolas" w:eastAsia="Consolas"/>
-          <w:sz w:val="17"/>
-        </w:rPr>
-        <w:t xml:space="preserve">              ---&gt;  DiagramEngine      ---&gt;  Diagram[]   (PlantUML + Mermaid)</w:t>
-      </w:r>
-    </w:p>
-    <w:p>
-      <w:pPr>
-        <w:spacing w:after="0" w:line="240" w:lineRule="auto"/>
-      </w:pPr>
-      <w:r>
-        <w:rPr>
-          <w:rFonts w:ascii="Consolas" w:hAnsi="Consolas" w:eastAsia="Consolas"/>
-          <w:sz w:val="17"/>
-        </w:rPr>
-        <w:t xml:space="preserve">              ---&gt;  EvaluationService  ---&gt;  Precision / Recall / F1</w:t>
-      </w:r>
-    </w:p>
-    <w:p>
-      <w:pPr>
-        <w:spacing w:after="160" w:before="0"/>
-        <w:jc w:val="both"/>
-      </w:pPr>
     </w:p>
     <w:p>
       <w:pPr>
@@ -1758,7 +1747,7 @@
         <w:drawing>
           <wp:inline xmlns:a="http://schemas.openxmlformats.org/drawingml/2006/main" xmlns:pic="http://schemas.openxmlformats.org/drawingml/2006/picture">
             <wp:extent cx="2423160" cy="4762522"/>
-            <wp:docPr id="1" name="Picture 1"/>
+            <wp:docPr id="2" name="Picture 2"/>
             <wp:cNvGraphicFramePr>
               <a:graphicFrameLocks noChangeAspect="1"/>
             </wp:cNvGraphicFramePr>
@@ -1770,7 +1759,7 @@
                     <pic:cNvPicPr/>
                   </pic:nvPicPr>
                   <pic:blipFill>
-                    <a:blip r:embed="rId10"/>
+                    <a:blip r:embed="rId11"/>
                     <a:stretch>
                       <a:fillRect/>
                     </a:stretch>
@@ -1801,7 +1790,7 @@
           <w:color w:val="595959"/>
           <w:sz w:val="17"/>
         </w:rPr>
-        <w:t>Figure 1 - Activity diagram: end-to-end reverse engineering workflow with human review gate (Experiment 4)</w:t>
+        <w:t>Figure 2 - Activity diagram: end-to-end reverse engineering workflow with human review gate (Experiment 4)</w:t>
       </w:r>
     </w:p>
     <w:p>
@@ -1847,7 +1836,7 @@
         <w:drawing>
           <wp:inline xmlns:a="http://schemas.openxmlformats.org/drawingml/2006/main" xmlns:pic="http://schemas.openxmlformats.org/drawingml/2006/picture">
             <wp:extent cx="5669280" cy="1951050"/>
-            <wp:docPr id="2" name="Picture 2"/>
+            <wp:docPr id="3" name="Picture 3"/>
             <wp:cNvGraphicFramePr>
               <a:graphicFrameLocks noChangeAspect="1"/>
             </wp:cNvGraphicFramePr>
@@ -1859,7 +1848,7 @@
                     <pic:cNvPicPr/>
                   </pic:nvPicPr>
                   <pic:blipFill>
-                    <a:blip r:embed="rId11"/>
+                    <a:blip r:embed="rId12"/>
                     <a:stretch>
                       <a:fillRect/>
                     </a:stretch>
@@ -1890,7 +1879,7 @@
           <w:color w:val="595959"/>
           <w:sz w:val="17"/>
         </w:rPr>
-        <w:t>Figure 2 - Level 0 context data flow diagram (Experiment 8)</w:t>
+        <w:t>Figure 3 - Level 0 context data flow diagram (Experiment 8)</w:t>
       </w:r>
     </w:p>
     <w:p>
@@ -1916,7 +1905,7 @@
         <w:drawing>
           <wp:inline xmlns:a="http://schemas.openxmlformats.org/drawingml/2006/main" xmlns:pic="http://schemas.openxmlformats.org/drawingml/2006/picture">
             <wp:extent cx="5760720" cy="3444853"/>
-            <wp:docPr id="3" name="Picture 3"/>
+            <wp:docPr id="4" name="Picture 4"/>
             <wp:cNvGraphicFramePr>
               <a:graphicFrameLocks noChangeAspect="1"/>
             </wp:cNvGraphicFramePr>
@@ -1928,7 +1917,7 @@
                     <pic:cNvPicPr/>
                   </pic:nvPicPr>
                   <pic:blipFill>
-                    <a:blip r:embed="rId12"/>
+                    <a:blip r:embed="rId13"/>
                     <a:stretch>
                       <a:fillRect/>
                     </a:stretch>
@@ -1959,7 +1948,7 @@
           <w:color w:val="595959"/>
           <w:sz w:val="17"/>
         </w:rPr>
-        <w:t>Figure 3 - Level 1 data flow decomposition (Experiment 8)</w:t>
+        <w:t>Figure 4 - Level 1 data flow decomposition (Experiment 8)</w:t>
       </w:r>
     </w:p>
     <w:p>
@@ -3228,7 +3217,7 @@
         <w:drawing>
           <wp:inline xmlns:a="http://schemas.openxmlformats.org/drawingml/2006/main" xmlns:pic="http://schemas.openxmlformats.org/drawingml/2006/picture">
             <wp:extent cx="5669280" cy="3188970"/>
-            <wp:docPr id="4" name="Picture 4"/>
+            <wp:docPr id="5" name="Picture 5"/>
             <wp:cNvGraphicFramePr>
               <a:graphicFrameLocks noChangeAspect="1"/>
             </wp:cNvGraphicFramePr>
@@ -3240,7 +3229,7 @@
                     <pic:cNvPicPr/>
                   </pic:nvPicPr>
                   <pic:blipFill>
-                    <a:blip r:embed="rId13"/>
+                    <a:blip r:embed="rId14"/>
                     <a:stretch>
                       <a:fillRect/>
                     </a:stretch>
@@ -3271,7 +3260,7 @@
           <w:color w:val="595959"/>
           <w:sz w:val="17"/>
         </w:rPr>
-        <w:t>Figure 4 - Stage 1: repository ingestion. The stepper shows pipeline progress; later stages remain locked until a repository is analysed.</w:t>
+        <w:t>Figure 5 - Stage 1: repository ingestion. The stepper shows pipeline progress; later stages remain locked until a repository is analysed.</w:t>
       </w:r>
     </w:p>
     <w:p>
@@ -3283,7 +3272,7 @@
         <w:drawing>
           <wp:inline xmlns:a="http://schemas.openxmlformats.org/drawingml/2006/main" xmlns:pic="http://schemas.openxmlformats.org/drawingml/2006/picture">
             <wp:extent cx="5486400" cy="4200525"/>
-            <wp:docPr id="5" name="Picture 5"/>
+            <wp:docPr id="6" name="Picture 6"/>
             <wp:cNvGraphicFramePr>
               <a:graphicFrameLocks noChangeAspect="1"/>
             </wp:cNvGraphicFramePr>
@@ -3295,7 +3284,7 @@
                     <pic:cNvPicPr/>
                   </pic:nvPicPr>
                   <pic:blipFill>
-                    <a:blip r:embed="rId14"/>
+                    <a:blip r:embed="rId15"/>
                     <a:stretch>
                       <a:fillRect/>
                     </a:stretch>
@@ -3326,7 +3315,7 @@
           <w:color w:val="595959"/>
           <w:sz w:val="17"/>
         </w:rPr>
-        <w:t>Figure 5 - Stage 2: automatically discovered features presented for developer review, each with its class membership and confidence score.</w:t>
+        <w:t>Figure 6 - Stage 2: automatically discovered features presented for developer review, each with its class membership and confidence score.</w:t>
       </w:r>
     </w:p>
     <w:p>
@@ -3357,7 +3346,7 @@
         <w:drawing>
           <wp:inline xmlns:a="http://schemas.openxmlformats.org/drawingml/2006/main" xmlns:pic="http://schemas.openxmlformats.org/drawingml/2006/picture">
             <wp:extent cx="2240280" cy="3881250"/>
-            <wp:docPr id="6" name="Picture 6"/>
+            <wp:docPr id="7" name="Picture 7"/>
             <wp:cNvGraphicFramePr>
               <a:graphicFrameLocks noChangeAspect="1"/>
             </wp:cNvGraphicFramePr>
@@ -3369,7 +3358,7 @@
                     <pic:cNvPicPr/>
                   </pic:nvPicPr>
                   <pic:blipFill>
-                    <a:blip r:embed="rId15"/>
+                    <a:blip r:embed="rId16"/>
                     <a:stretch>
                       <a:fillRect/>
                     </a:stretch>
@@ -3400,7 +3389,7 @@
           <w:color w:val="595959"/>
           <w:sz w:val="17"/>
         </w:rPr>
-        <w:t>Figure 6 - Generated class diagram for the discovered Tell Story feature</w:t>
+        <w:t>Figure 7 - Generated class diagram for the discovered Tell Story feature</w:t>
       </w:r>
     </w:p>
     <w:p>
@@ -3412,7 +3401,7 @@
         <w:drawing>
           <wp:inline xmlns:a="http://schemas.openxmlformats.org/drawingml/2006/main" xmlns:pic="http://schemas.openxmlformats.org/drawingml/2006/picture">
             <wp:extent cx="2651760" cy="2395728"/>
-            <wp:docPr id="7" name="Picture 7"/>
+            <wp:docPr id="8" name="Picture 8"/>
             <wp:cNvGraphicFramePr>
               <a:graphicFrameLocks noChangeAspect="1"/>
             </wp:cNvGraphicFramePr>
@@ -3424,7 +3413,7 @@
                     <pic:cNvPicPr/>
                   </pic:nvPicPr>
                   <pic:blipFill>
-                    <a:blip r:embed="rId16"/>
+                    <a:blip r:embed="rId17"/>
                     <a:stretch>
                       <a:fillRect/>
                     </a:stretch>
@@ -3455,7 +3444,7 @@
           <w:color w:val="595959"/>
           <w:sz w:val="17"/>
         </w:rPr>
-        <w:t>Figure 7 - Generated sequence diagram for the same feature, derived from static call sites</w:t>
+        <w:t>Figure 8 - Generated sequence diagram for the same feature, derived from static call sites</w:t>
       </w:r>
     </w:p>
     <w:p>

</xml_diff>